<commit_message>
Add Observations bullet list to the Section 3 Word draft
Adds a bulleted Observations block after the two figures, mirroring
the notebook's Section 3 observations cell but corrected for phishing
as the positive class (the notebook's original bullet said CV F1 used
legitimate, which is now stale).

Co-Authored-By: Claude Sonnet 5 <noreply@anthropic.com>
</commit_message>
<xml_diff>
--- a/reports/Section3_Initial_Model_Development.docx
+++ b/reports/Section3_Initial_Model_Development.docx
@@ -2089,6 +2089,203 @@
         <w:t xml:space="preserve">Held-out confusion matrices for the four url_only models (phishing vs. legitimate). The majority baseline never predicts phishing; the three learned models each miss fewer than 250 of the 25,130 held-out phishing URLs.</w:t>
       </w:r>
     </w:p>
+    <w:p>
+      <w:pPr>
+        <w:spacing w:after="120" w:before="240"/>
+      </w:pPr>
+      <w:r>
+        <w:rPr>
+          <w:rFonts w:ascii="Times New Roman" w:cs="Times New Roman" w:eastAsia="Times New Roman" w:hAnsi="Times New Roman"/>
+          <w:b/>
+          <w:bCs/>
+          <w:sz w:val="24"/>
+          <w:szCs w:val="24"/>
+        </w:rPr>
+        <w:t xml:space="preserve">Observations:</w:t>
+      </w:r>
+    </w:p>
+    <w:p>
+      <w:pPr>
+        <w:pStyle w:val="ListParagraph"/>
+        <w:numPr>
+          <w:ilvl w:val="0"/>
+          <w:numId w:val="2"/>
+        </w:numPr>
+        <w:spacing w:after="0" w:line="480" w:lineRule="auto"/>
+      </w:pPr>
+      <w:r>
+        <w:rPr>
+          <w:rFonts w:ascii="Times New Roman" w:cs="Times New Roman" w:eastAsia="Times New Roman" w:hAnsi="Times New Roman"/>
+          <w:b w:val="false"/>
+          <w:bCs w:val="false"/>
+          <w:i w:val="false"/>
+          <w:iCs w:val="false"/>
+          <w:sz w:val="24"/>
+          <w:szCs w:val="24"/>
+        </w:rPr>
+        <w:t xml:space="preserve">The url_only random forest achieved 99.73% accuracy, 99.92% phishing precision, and 99.44% phishing recall: 140 phishing URLs were missed and 20 legitimate URLs were misclassified as phishing.</w:t>
+      </w:r>
+    </w:p>
+    <w:p>
+      <w:pPr>
+        <w:pStyle w:val="ListParagraph"/>
+        <w:numPr>
+          <w:ilvl w:val="0"/>
+          <w:numId w:val="2"/>
+        </w:numPr>
+        <w:spacing w:after="0" w:line="480" w:lineRule="auto"/>
+      </w:pPr>
+      <w:r>
+        <w:rPr>
+          <w:rFonts w:ascii="Times New Roman" w:cs="Times New Roman" w:eastAsia="Times New Roman" w:hAnsi="Times New Roman"/>
+          <w:b w:val="false"/>
+          <w:bCs w:val="false"/>
+          <w:i w:val="false"/>
+          <w:iCs w:val="false"/>
+          <w:sz w:val="24"/>
+          <w:szCs w:val="24"/>
+        </w:rPr>
+        <w:t xml:space="preserve">Full-feature (</w:t>
+      </w:r>
+      <w:r>
+        <w:rPr>
+          <w:rFonts w:ascii="Times New Roman" w:cs="Times New Roman" w:eastAsia="Times New Roman" w:hAnsi="Times New Roman"/>
+          <w:b w:val="false"/>
+          <w:bCs w:val="false"/>
+          <w:i/>
+          <w:iCs/>
+          <w:sz w:val="24"/>
+          <w:szCs w:val="24"/>
+        </w:rPr>
+        <w:t xml:space="preserve">full</w:t>
+      </w:r>
+      <w:r>
+        <w:rPr>
+          <w:rFonts w:ascii="Times New Roman" w:cs="Times New Roman" w:eastAsia="Times New Roman" w:hAnsi="Times New Roman"/>
+          <w:b w:val="false"/>
+          <w:bCs w:val="false"/>
+          <w:i w:val="false"/>
+          <w:iCs w:val="false"/>
+          <w:sz w:val="24"/>
+          <w:szCs w:val="24"/>
+        </w:rPr>
+        <w:t xml:space="preserve">) accuracy reaches 100% for the decision tree and random forest; this motivates investigation of dataset construction artifacts (Section 2) rather than a deployment-readiness claim.</w:t>
+      </w:r>
+    </w:p>
+    <w:p>
+      <w:pPr>
+        <w:pStyle w:val="ListParagraph"/>
+        <w:numPr>
+          <w:ilvl w:val="0"/>
+          <w:numId w:val="2"/>
+        </w:numPr>
+        <w:spacing w:after="0" w:line="480" w:lineRule="auto"/>
+      </w:pPr>
+      <w:r>
+        <w:rPr>
+          <w:rFonts w:ascii="Times New Roman" w:cs="Times New Roman" w:eastAsia="Times New Roman" w:hAnsi="Times New Roman"/>
+          <w:b w:val="false"/>
+          <w:bCs w:val="false"/>
+          <w:i w:val="false"/>
+          <w:iCs w:val="false"/>
+          <w:sz w:val="24"/>
+          <w:szCs w:val="24"/>
+        </w:rPr>
+        <w:t xml:space="preserve">Dropping the six construction-derived and twenty-six page-content features (</w:t>
+      </w:r>
+      <w:r>
+        <w:rPr>
+          <w:rFonts w:ascii="Times New Roman" w:cs="Times New Roman" w:eastAsia="Times New Roman" w:hAnsi="Times New Roman"/>
+          <w:b w:val="false"/>
+          <w:bCs w:val="false"/>
+          <w:i/>
+          <w:iCs/>
+          <w:sz w:val="24"/>
+          <w:szCs w:val="24"/>
+        </w:rPr>
+        <w:t xml:space="preserve">full</w:t>
+      </w:r>
+      <w:r>
+        <w:rPr>
+          <w:rFonts w:ascii="Times New Roman" w:cs="Times New Roman" w:eastAsia="Times New Roman" w:hAnsi="Times New Roman"/>
+          <w:b w:val="false"/>
+          <w:bCs w:val="false"/>
+          <w:i w:val="false"/>
+          <w:iCs w:val="false"/>
+          <w:sz w:val="24"/>
+          <w:szCs w:val="24"/>
+        </w:rPr>
+        <w:t xml:space="preserve"> → </w:t>
+      </w:r>
+      <w:r>
+        <w:rPr>
+          <w:rFonts w:ascii="Times New Roman" w:cs="Times New Roman" w:eastAsia="Times New Roman" w:hAnsi="Times New Roman"/>
+          <w:b w:val="false"/>
+          <w:bCs w:val="false"/>
+          <w:i/>
+          <w:iCs/>
+          <w:sz w:val="24"/>
+          <w:szCs w:val="24"/>
+        </w:rPr>
+        <w:t xml:space="preserve">url_only</w:t>
+      </w:r>
+      <w:r>
+        <w:rPr>
+          <w:rFonts w:ascii="Times New Roman" w:cs="Times New Roman" w:eastAsia="Times New Roman" w:hAnsi="Times New Roman"/>
+          <w:b w:val="false"/>
+          <w:bCs w:val="false"/>
+          <w:i w:val="false"/>
+          <w:iCs w:val="false"/>
+          <w:sz w:val="24"/>
+          <w:szCs w:val="24"/>
+        </w:rPr>
+        <w:t xml:space="preserve">) costs only about 0.27 percentage points of accuracy, indicating the two classes remain separable from URL-lexical features alone.</w:t>
+      </w:r>
+    </w:p>
+    <w:p>
+      <w:pPr>
+        <w:pStyle w:val="ListParagraph"/>
+        <w:numPr>
+          <w:ilvl w:val="0"/>
+          <w:numId w:val="2"/>
+        </w:numPr>
+        <w:spacing w:after="0" w:line="480" w:lineRule="auto"/>
+      </w:pPr>
+      <w:r>
+        <w:rPr>
+          <w:rFonts w:ascii="Times New Roman" w:cs="Times New Roman" w:eastAsia="Times New Roman" w:hAnsi="Times New Roman"/>
+          <w:b w:val="false"/>
+          <w:bCs w:val="false"/>
+          <w:i w:val="false"/>
+          <w:iCs w:val="false"/>
+          <w:sz w:val="24"/>
+          <w:szCs w:val="24"/>
+        </w:rPr>
+        <w:t xml:space="preserve">All reported precision, recall, F1, and CV F1 use phishing (label 0) as the positive class, not scikit-learn's default of legitimate (label 1); the majority baseline's phishing F1 of 0.0000 makes that choice's effect visible.</w:t>
+      </w:r>
+    </w:p>
+    <w:p>
+      <w:pPr>
+        <w:pStyle w:val="ListParagraph"/>
+        <w:numPr>
+          <w:ilvl w:val="0"/>
+          <w:numId w:val="2"/>
+        </w:numPr>
+        <w:spacing w:after="0" w:line="480" w:lineRule="auto"/>
+      </w:pPr>
+      <w:r>
+        <w:rPr>
+          <w:rFonts w:ascii="Times New Roman" w:cs="Times New Roman" w:eastAsia="Times New Roman" w:hAnsi="Times New Roman"/>
+          <w:b w:val="false"/>
+          <w:bCs w:val="false"/>
+          <w:i w:val="false"/>
+          <w:iCs w:val="false"/>
+          <w:sz w:val="24"/>
+          <w:szCs w:val="24"/>
+        </w:rPr>
+        <w:t xml:space="preserve">The majority-baseline accuracy of 57.29% is the floor every learned model is compared against, reflecting the dataset's class balance (134,850 legitimate vs. 100,520 phishing rows).</w:t>
+      </w:r>
+    </w:p>
     <w:sectPr>
       <w:pgSz w:w="12240" w:h="15840" w:orient="portrait"/>
       <w:pgMar w:top="1440" w:right="1440" w:bottom="1440" w:left="1440" w:header="708" w:footer="708" w:gutter="0"/>
@@ -2263,8 +2460,26 @@
       </w:pPr>
     </w:lvl>
   </w:abstractNum>
+  <w:abstractNum w:abstractNumId="2" w15:restartNumberingAfterBreak="0">
+    <w:multiLevelType w:val="hybridMultilevel"/>
+    <w:lvl w:ilvl="0" w15:tentative="1">
+      <w:start w:val="1"/>
+      <w:numFmt w:val="bullet"/>
+      <w:lvlText w:val="•"/>
+      <w:lvlJc w:val="left"/>
+      <w:pPr>
+        <w:ind w:left="720" w:hanging="360"/>
+      </w:pPr>
+    </w:lvl>
+  </w:abstractNum>
   <w:num w:numId="1">
     <w:abstractNumId w:val="1"/>
+    <w:lvlOverride w:ilvl="0">
+      <w:startOverride w:val="1"/>
+    </w:lvlOverride>
+  </w:num>
+  <w:num w:numId="2">
+    <w:abstractNumId w:val="2"/>
     <w:lvlOverride w:ilvl="0">
       <w:startOverride w:val="1"/>
     </w:lvlOverride>

</xml_diff>

<commit_message>
Restructure Section 3 Word draft into notebook-style Observations blocks
Replaces the long prose paragraphs with the notebook's own pattern:
short setup text, then a table or figure, then a short Observations
bullet list right after it. Three Observations blocks now sit after
the results table, the accuracy figure, and the confusion-matrix
figure respectively, instead of one combined list at the end.

Co-Authored-By: Claude Sonnet 5 <noreply@anthropic.com>
</commit_message>
<xml_diff>
--- a/reports/Section3_Initial_Model_Development.docx
+++ b/reports/Section3_Initial_Model_Development.docx
@@ -1768,9 +1768,27 @@
     </w:p>
     <w:p>
       <w:pPr>
+        <w:spacing w:after="120" w:before="240"/>
+      </w:pPr>
+      <w:r>
+        <w:rPr>
+          <w:rFonts w:ascii="Times New Roman" w:cs="Times New Roman" w:eastAsia="Times New Roman" w:hAnsi="Times New Roman"/>
+          <w:b/>
+          <w:bCs/>
+          <w:sz w:val="24"/>
+          <w:szCs w:val="24"/>
+        </w:rPr>
+        <w:t xml:space="preserve">Observations:</w:t>
+      </w:r>
+    </w:p>
+    <w:p>
+      <w:pPr>
+        <w:pStyle w:val="ListParagraph"/>
+        <w:numPr>
+          <w:ilvl w:val="0"/>
+          <w:numId w:val="2"/>
+        </w:numPr>
         <w:spacing w:after="0" w:line="480" w:lineRule="auto"/>
-        <w:ind w:firstLine="720"/>
-        <w:jc w:val="both"/>
       </w:pPr>
       <w:r>
         <w:rPr>
@@ -1782,7 +1800,7 @@
           <w:sz w:val="24"/>
           <w:szCs w:val="24"/>
         </w:rPr>
-        <w:t xml:space="preserve">The majority baseline's phishing F1 is 0.0000 by construction: predicting "legitimate" for every URL never identifies a phishing URL, so phishing precision, recall, and F1 are all zero even though accuracy is 57.29% — a reminder that accuracy alone is the wrong metric for this class balance. Full metrics, per-model confusion matrices, and timestamps are in </w:t>
+        <w:t xml:space="preserve">Accuracy moves from 1.0000 to 0.9999 to 0.9973 across </w:t>
       </w:r>
       <w:r>
         <w:rPr>
@@ -1794,7 +1812,7 @@
           <w:sz w:val="24"/>
           <w:szCs w:val="24"/>
         </w:rPr>
-        <w:t xml:space="preserve">results/metrics_stratified_&lt;feature_set&gt;_&lt;model&gt;.json</w:t>
+        <w:t xml:space="preserve">full</w:t>
       </w:r>
       <w:r>
         <w:rPr>
@@ -1806,7 +1824,7 @@
           <w:sz w:val="24"/>
           <w:szCs w:val="24"/>
         </w:rPr>
-        <w:t xml:space="preserve">; the comparison table with all four metrics per row is </w:t>
+        <w:t xml:space="preserve"> → </w:t>
       </w:r>
       <w:r>
         <w:rPr>
@@ -1818,7 +1836,7 @@
           <w:sz w:val="24"/>
           <w:szCs w:val="24"/>
         </w:rPr>
-        <w:t xml:space="preserve">results/initial_model_comparison.csv</w:t>
+        <w:t xml:space="preserve">no_derived</w:t>
       </w:r>
       <w:r>
         <w:rPr>
@@ -1830,14 +1848,41 @@
           <w:sz w:val="24"/>
           <w:szCs w:val="24"/>
         </w:rPr>
-        <w:t xml:space="preserve">.</w:t>
+        <w:t xml:space="preserve"> → </w:t>
+      </w:r>
+      <w:r>
+        <w:rPr>
+          <w:rFonts w:ascii="Times New Roman" w:cs="Times New Roman" w:eastAsia="Times New Roman" w:hAnsi="Times New Roman"/>
+          <w:b w:val="false"/>
+          <w:bCs w:val="false"/>
+          <w:i/>
+          <w:iCs/>
+          <w:sz w:val="24"/>
+          <w:szCs w:val="24"/>
+        </w:rPr>
+        <w:t xml:space="preserve">url_only</w:t>
+      </w:r>
+      <w:r>
+        <w:rPr>
+          <w:rFonts w:ascii="Times New Roman" w:cs="Times New Roman" w:eastAsia="Times New Roman" w:hAnsi="Times New Roman"/>
+          <w:b w:val="false"/>
+          <w:bCs w:val="false"/>
+          <w:i w:val="false"/>
+          <w:iCs w:val="false"/>
+          <w:sz w:val="24"/>
+          <w:szCs w:val="24"/>
+        </w:rPr>
+        <w:t xml:space="preserve"> — the flat ablation the leakage screen (Section 2) predicted: removing the derived and page-content features costs about a quarter of a percentage point, not a large gap.</w:t>
       </w:r>
     </w:p>
     <w:p>
       <w:pPr>
+        <w:pStyle w:val="ListParagraph"/>
+        <w:numPr>
+          <w:ilvl w:val="0"/>
+          <w:numId w:val="2"/>
+        </w:numPr>
         <w:spacing w:after="0" w:line="480" w:lineRule="auto"/>
-        <w:ind w:firstLine="720"/>
-        <w:jc w:val="both"/>
       </w:pPr>
       <w:r>
         <w:rPr>
@@ -1849,7 +1894,51 @@
           <w:sz w:val="24"/>
           <w:szCs w:val="24"/>
         </w:rPr>
-        <w:t xml:space="preserve">The result is the flat ablation the leakage screen predicted: accuracy moves from 1.0000 to 0.9999 to 0.9973 across </w:t>
+        <w:t xml:space="preserve">The majority baseline's phishing F1 is 0.0000 by construction: predicting "legitimate" for every URL never identifies a phishing URL, even though its accuracy (57.29%) matches the class balance.</w:t>
+      </w:r>
+    </w:p>
+    <w:p>
+      <w:pPr>
+        <w:pStyle w:val="ListParagraph"/>
+        <w:numPr>
+          <w:ilvl w:val="0"/>
+          <w:numId w:val="2"/>
+        </w:numPr>
+        <w:spacing w:after="0" w:line="480" w:lineRule="auto"/>
+      </w:pPr>
+      <w:r>
+        <w:rPr>
+          <w:rFonts w:ascii="Times New Roman" w:cs="Times New Roman" w:eastAsia="Times New Roman" w:hAnsi="Times New Roman"/>
+          <w:b w:val="false"/>
+          <w:bCs w:val="false"/>
+          <w:i w:val="false"/>
+          <w:iCs w:val="false"/>
+          <w:sz w:val="24"/>
+          <w:szCs w:val="24"/>
+        </w:rPr>
+        <w:t xml:space="preserve">Precision, recall, F1, and CV F1 above are computed for phishing (label 0) as the positive class, not scikit-learn's default of legitimate (label 1); accuracy and ROC AUC are unaffected by that choice.</w:t>
+      </w:r>
+    </w:p>
+    <w:p>
+      <w:pPr>
+        <w:pStyle w:val="ListParagraph"/>
+        <w:numPr>
+          <w:ilvl w:val="0"/>
+          <w:numId w:val="2"/>
+        </w:numPr>
+        <w:spacing w:after="0" w:line="480" w:lineRule="auto"/>
+      </w:pPr>
+      <w:r>
+        <w:rPr>
+          <w:rFonts w:ascii="Times New Roman" w:cs="Times New Roman" w:eastAsia="Times New Roman" w:hAnsi="Times New Roman"/>
+          <w:b w:val="false"/>
+          <w:bCs w:val="false"/>
+          <w:i w:val="false"/>
+          <w:iCs w:val="false"/>
+          <w:sz w:val="24"/>
+          <w:szCs w:val="24"/>
+        </w:rPr>
+        <w:t xml:space="preserve">Full metrics, per-model confusion matrices, and timestamps are in </w:t>
       </w:r>
       <w:r>
         <w:rPr>
@@ -1861,7 +1950,7 @@
           <w:sz w:val="24"/>
           <w:szCs w:val="24"/>
         </w:rPr>
-        <w:t xml:space="preserve">full</w:t>
+        <w:t xml:space="preserve">results/metrics_stratified_&lt;feature_set&gt;_&lt;model&gt;.json</w:t>
       </w:r>
       <w:r>
         <w:rPr>
@@ -1873,7 +1962,7 @@
           <w:sz w:val="24"/>
           <w:szCs w:val="24"/>
         </w:rPr>
-        <w:t xml:space="preserve"> → </w:t>
+        <w:t xml:space="preserve">; the full table is </w:t>
       </w:r>
       <w:r>
         <w:rPr>
@@ -1885,7 +1974,7 @@
           <w:sz w:val="24"/>
           <w:szCs w:val="24"/>
         </w:rPr>
-        <w:t xml:space="preserve">no_derived</w:t>
+        <w:t xml:space="preserve">results/initial_model_comparison.csv</w:t>
       </w:r>
       <w:r>
         <w:rPr>
@@ -1897,31 +1986,7 @@
           <w:sz w:val="24"/>
           <w:szCs w:val="24"/>
         </w:rPr>
-        <w:t xml:space="preserve"> → </w:t>
-      </w:r>
-      <w:r>
-        <w:rPr>
-          <w:rFonts w:ascii="Times New Roman" w:cs="Times New Roman" w:eastAsia="Times New Roman" w:hAnsi="Times New Roman"/>
-          <w:b w:val="false"/>
-          <w:bCs w:val="false"/>
-          <w:i/>
-          <w:iCs/>
-          <w:sz w:val="24"/>
-          <w:szCs w:val="24"/>
-        </w:rPr>
-        <w:t xml:space="preserve">url_only</w:t>
-      </w:r>
-      <w:r>
-        <w:rPr>
-          <w:rFonts w:ascii="Times New Roman" w:cs="Times New Roman" w:eastAsia="Times New Roman" w:hAnsi="Times New Roman"/>
-          <w:b w:val="false"/>
-          <w:bCs w:val="false"/>
-          <w:i w:val="false"/>
-          <w:iCs w:val="false"/>
-          <w:sz w:val="24"/>
-          <w:szCs w:val="24"/>
-        </w:rPr>
-        <w:t xml:space="preserve">. Removing all six construction-derived features and all twenty-six page-content features — features unavailable at the moment a URL must actually be judged, before any page is fetched — costs about a quarter of a percentage point, not the large gap the single-feature screen alone would suggest. This benchmark cannot be repaired by dropping a named feature group; the classes differ systematically in shape (Section 2) rather than in one removable column.</w:t>
+        <w:t xml:space="preserve">.</w:t>
       </w:r>
     </w:p>
     <w:p>
@@ -1994,14 +2059,32 @@
           <w:szCs w:val="24"/>
         </w:rPr>
         <w:br/>
-        <w:t xml:space="preserve">Held-out test accuracy by model and feature set. The majority baseline (57.3%) reflects the class balance; all three learned models exceed 99.7% accuracy in every feature configuration.</w:t>
+        <w:t xml:space="preserve">Held-out test accuracy by model and feature set.</w:t>
       </w:r>
     </w:p>
     <w:p>
       <w:pPr>
+        <w:spacing w:after="120" w:before="240"/>
+      </w:pPr>
+      <w:r>
+        <w:rPr>
+          <w:rFonts w:ascii="Times New Roman" w:cs="Times New Roman" w:eastAsia="Times New Roman" w:hAnsi="Times New Roman"/>
+          <w:b/>
+          <w:bCs/>
+          <w:sz w:val="24"/>
+          <w:szCs w:val="24"/>
+        </w:rPr>
+        <w:t xml:space="preserve">Observations:</w:t>
+      </w:r>
+    </w:p>
+    <w:p>
+      <w:pPr>
+        <w:pStyle w:val="ListParagraph"/>
+        <w:numPr>
+          <w:ilvl w:val="0"/>
+          <w:numId w:val="2"/>
+        </w:numPr>
         <w:spacing w:after="0" w:line="480" w:lineRule="auto"/>
-        <w:ind w:firstLine="720"/>
-        <w:jc w:val="both"/>
       </w:pPr>
       <w:r>
         <w:rPr>
@@ -2013,7 +2096,7 @@
           <w:sz w:val="24"/>
           <w:szCs w:val="24"/>
         </w:rPr>
-        <w:t xml:space="preserve">The url_only random forest is the strongest model that avoids both the construction-derived and page-content features: on the held-out test set it reaches 99.92% phishing precision and 99.44% phishing recall (140 phishing URLs missed out of 25,130; 20 legitimate URLs misclassified out of 33,713), as shown for all four url_only models in Figure 2.</w:t>
+        <w:t xml:space="preserve">The majority baseline (57.3% accuracy) is the floor every learned model is compared against; all three learned models exceed 99.7% accuracy in every feature configuration, regardless of feature set.</w:t>
       </w:r>
     </w:p>
     <w:p>
@@ -2086,7 +2169,7 @@
           <w:szCs w:val="24"/>
         </w:rPr>
         <w:br/>
-        <w:t xml:space="preserve">Held-out confusion matrices for the four url_only models (phishing vs. legitimate). The majority baseline never predicts phishing; the three learned models each miss fewer than 250 of the 25,130 held-out phishing URLs.</w:t>
+        <w:t xml:space="preserve">Held-out confusion matrices for the four url_only models (phishing vs. legitimate).</w:t>
       </w:r>
     </w:p>
     <w:p>
@@ -2123,7 +2206,7 @@
           <w:sz w:val="24"/>
           <w:szCs w:val="24"/>
         </w:rPr>
-        <w:t xml:space="preserve">The url_only random forest achieved 99.73% accuracy, 99.92% phishing precision, and 99.44% phishing recall: 140 phishing URLs were missed and 20 legitimate URLs were misclassified as phishing.</w:t>
+        <w:t xml:space="preserve">The url_only random forest — the strongest model that avoids both construction-derived and page-content features — reaches 99.92% phishing precision and 99.44% phishing recall on the held-out test set: 140 of 25,130 phishing URLs missed, 20 of 33,713 legitimate URLs misclassified.</w:t>
       </w:r>
     </w:p>
     <w:p>
@@ -2145,145 +2228,7 @@
           <w:sz w:val="24"/>
           <w:szCs w:val="24"/>
         </w:rPr>
-        <w:t xml:space="preserve">Full-feature (</w:t>
-      </w:r>
-      <w:r>
-        <w:rPr>
-          <w:rFonts w:ascii="Times New Roman" w:cs="Times New Roman" w:eastAsia="Times New Roman" w:hAnsi="Times New Roman"/>
-          <w:b w:val="false"/>
-          <w:bCs w:val="false"/>
-          <w:i/>
-          <w:iCs/>
-          <w:sz w:val="24"/>
-          <w:szCs w:val="24"/>
-        </w:rPr>
-        <w:t xml:space="preserve">full</w:t>
-      </w:r>
-      <w:r>
-        <w:rPr>
-          <w:rFonts w:ascii="Times New Roman" w:cs="Times New Roman" w:eastAsia="Times New Roman" w:hAnsi="Times New Roman"/>
-          <w:b w:val="false"/>
-          <w:bCs w:val="false"/>
-          <w:i w:val="false"/>
-          <w:iCs w:val="false"/>
-          <w:sz w:val="24"/>
-          <w:szCs w:val="24"/>
-        </w:rPr>
-        <w:t xml:space="preserve">) accuracy reaches 100% for the decision tree and random forest; this motivates investigation of dataset construction artifacts (Section 2) rather than a deployment-readiness claim.</w:t>
-      </w:r>
-    </w:p>
-    <w:p>
-      <w:pPr>
-        <w:pStyle w:val="ListParagraph"/>
-        <w:numPr>
-          <w:ilvl w:val="0"/>
-          <w:numId w:val="2"/>
-        </w:numPr>
-        <w:spacing w:after="0" w:line="480" w:lineRule="auto"/>
-      </w:pPr>
-      <w:r>
-        <w:rPr>
-          <w:rFonts w:ascii="Times New Roman" w:cs="Times New Roman" w:eastAsia="Times New Roman" w:hAnsi="Times New Roman"/>
-          <w:b w:val="false"/>
-          <w:bCs w:val="false"/>
-          <w:i w:val="false"/>
-          <w:iCs w:val="false"/>
-          <w:sz w:val="24"/>
-          <w:szCs w:val="24"/>
-        </w:rPr>
-        <w:t xml:space="preserve">Dropping the six construction-derived and twenty-six page-content features (</w:t>
-      </w:r>
-      <w:r>
-        <w:rPr>
-          <w:rFonts w:ascii="Times New Roman" w:cs="Times New Roman" w:eastAsia="Times New Roman" w:hAnsi="Times New Roman"/>
-          <w:b w:val="false"/>
-          <w:bCs w:val="false"/>
-          <w:i/>
-          <w:iCs/>
-          <w:sz w:val="24"/>
-          <w:szCs w:val="24"/>
-        </w:rPr>
-        <w:t xml:space="preserve">full</w:t>
-      </w:r>
-      <w:r>
-        <w:rPr>
-          <w:rFonts w:ascii="Times New Roman" w:cs="Times New Roman" w:eastAsia="Times New Roman" w:hAnsi="Times New Roman"/>
-          <w:b w:val="false"/>
-          <w:bCs w:val="false"/>
-          <w:i w:val="false"/>
-          <w:iCs w:val="false"/>
-          <w:sz w:val="24"/>
-          <w:szCs w:val="24"/>
-        </w:rPr>
-        <w:t xml:space="preserve"> → </w:t>
-      </w:r>
-      <w:r>
-        <w:rPr>
-          <w:rFonts w:ascii="Times New Roman" w:cs="Times New Roman" w:eastAsia="Times New Roman" w:hAnsi="Times New Roman"/>
-          <w:b w:val="false"/>
-          <w:bCs w:val="false"/>
-          <w:i/>
-          <w:iCs/>
-          <w:sz w:val="24"/>
-          <w:szCs w:val="24"/>
-        </w:rPr>
-        <w:t xml:space="preserve">url_only</w:t>
-      </w:r>
-      <w:r>
-        <w:rPr>
-          <w:rFonts w:ascii="Times New Roman" w:cs="Times New Roman" w:eastAsia="Times New Roman" w:hAnsi="Times New Roman"/>
-          <w:b w:val="false"/>
-          <w:bCs w:val="false"/>
-          <w:i w:val="false"/>
-          <w:iCs w:val="false"/>
-          <w:sz w:val="24"/>
-          <w:szCs w:val="24"/>
-        </w:rPr>
-        <w:t xml:space="preserve">) costs only about 0.27 percentage points of accuracy, indicating the two classes remain separable from URL-lexical features alone.</w:t>
-      </w:r>
-    </w:p>
-    <w:p>
-      <w:pPr>
-        <w:pStyle w:val="ListParagraph"/>
-        <w:numPr>
-          <w:ilvl w:val="0"/>
-          <w:numId w:val="2"/>
-        </w:numPr>
-        <w:spacing w:after="0" w:line="480" w:lineRule="auto"/>
-      </w:pPr>
-      <w:r>
-        <w:rPr>
-          <w:rFonts w:ascii="Times New Roman" w:cs="Times New Roman" w:eastAsia="Times New Roman" w:hAnsi="Times New Roman"/>
-          <w:b w:val="false"/>
-          <w:bCs w:val="false"/>
-          <w:i w:val="false"/>
-          <w:iCs w:val="false"/>
-          <w:sz w:val="24"/>
-          <w:szCs w:val="24"/>
-        </w:rPr>
-        <w:t xml:space="preserve">All reported precision, recall, F1, and CV F1 use phishing (label 0) as the positive class, not scikit-learn's default of legitimate (label 1); the majority baseline's phishing F1 of 0.0000 makes that choice's effect visible.</w:t>
-      </w:r>
-    </w:p>
-    <w:p>
-      <w:pPr>
-        <w:pStyle w:val="ListParagraph"/>
-        <w:numPr>
-          <w:ilvl w:val="0"/>
-          <w:numId w:val="2"/>
-        </w:numPr>
-        <w:spacing w:after="0" w:line="480" w:lineRule="auto"/>
-      </w:pPr>
-      <w:r>
-        <w:rPr>
-          <w:rFonts w:ascii="Times New Roman" w:cs="Times New Roman" w:eastAsia="Times New Roman" w:hAnsi="Times New Roman"/>
-          <w:b w:val="false"/>
-          <w:bCs w:val="false"/>
-          <w:i w:val="false"/>
-          <w:iCs w:val="false"/>
-          <w:sz w:val="24"/>
-          <w:szCs w:val="24"/>
-        </w:rPr>
-        <w:t xml:space="preserve">The majority-baseline accuracy of 57.29% is the floor every learned model is compared against, reflecting the dataset's class balance (134,850 legitimate vs. 100,520 phishing rows).</w:t>
+        <w:t xml:space="preserve">The majority baseline never predicts phishing at all (0 of 25,130 caught); each learned model closes nearly all of that gap using only URL-lexical features, available before any page is fetched.</w:t>
       </w:r>
     </w:p>
     <w:sectPr>

</xml_diff>